<commit_message>
docs: actualizacion de opciones y comandos en el informe
</commit_message>
<xml_diff>
--- a/TPRedesDatos-COM1-Vallejos_Casariego.docx
+++ b/TPRedesDatos-COM1-Vallejos_Casariego.docx
@@ -1872,275 +1872,118 @@
         </w:rPr>
       </w:pPr>
       <w:r>
-        <w:rPr>
-          <w:b w:val="1"/>
-          <w:bCs w:val="1"/>
-          <w:sz w:val="24"/>
-          <w:szCs w:val="24"/>
-          <w:u w:val="single"/>
-          <w:rtl w:val="0"/>
-        </w:rPr>
-        <w:t xml:space="preserve">Opción 4</w:t>
-      </w:r>
-      <w:r>
-        <w:rPr>
-          <w:sz w:val="24"/>
-          <w:szCs w:val="24"/>
-          <w:rtl w:val="0"/>
-        </w:rPr>
-        <w:t xml:space="preserve">: Agregar libro.</w:t>
-      </w:r>
-    </w:p>
-    <w:p>
-      <w:pPr>
-        <w:spacing w:after="0" w:before="0" w:line="360" w:lineRule="auto"/>
-        <w:rPr>
-          <w:sz w:val="24"/>
-          <w:szCs w:val="24"/>
-        </w:rPr>
-      </w:pPr>
-      <w:r>
-        <w:rPr>
-          <w:sz w:val="24"/>
-          <w:szCs w:val="24"/>
-          <w:rtl w:val="0"/>
-        </w:rPr>
-        <w:t xml:space="preserve">En esta opción se permite agregar un nuevo libro a la base de datos enviando los datos en formato JSON mediante </w:t>
-      </w:r>
-      <w:r>
-        <w:rPr>
-          <w:sz w:val="24"/>
-          <w:szCs w:val="24"/>
-          <w:rtl w:val="0"/>
-        </w:rPr>
-        <w:t xml:space="preserve">requests.post(f"</w:t>
-      </w:r>
-      <w:r>
-        <w:rPr>
-          <w:sz w:val="24"/>
-          <w:szCs w:val="24"/>
-          <w:rtl w:val="0"/>
-        </w:rPr>
-        <w:t xml:space="preserve">{</w:t>
-      </w:r>
-      <w:r>
-        <w:rPr>
-          <w:sz w:val="24"/>
-          <w:szCs w:val="24"/>
-          <w:rtl w:val="0"/>
-        </w:rPr>
-        <w:t xml:space="preserve">URL</w:t>
-      </w:r>
-      <w:r>
-        <w:rPr>
-          <w:sz w:val="24"/>
-          <w:szCs w:val="24"/>
-          <w:rtl w:val="0"/>
-        </w:rPr>
-        <w:t xml:space="preserve">}/libros", json=libro, auth=(USUARIO, PASSWORD))</w:t>
-      </w:r>
-      <w:r>
-        <w:rPr>
-          <w:sz w:val="24"/>
-          <w:szCs w:val="24"/>
-          <w:rtl w:val="0"/>
-        </w:rPr>
-        <w:t xml:space="preserve">. Esta operación requiere autenticación. </w:t>
-      </w:r>
-    </w:p>
-    <w:p>
-      <w:pPr>
-        <w:spacing w:after="0" w:before="0" w:line="360" w:lineRule="auto"/>
-        <w:rPr>
-          <w:sz w:val="24"/>
-          <w:szCs w:val="24"/>
-        </w:rPr>
-      </w:pPr>
-      <w:r>
-        <w:rPr>
-          <w:rtl w:val="0"/>
-        </w:rPr>
-      </w:r>
-    </w:p>
-    <w:p>
-      <w:pPr>
-        <w:spacing w:after="0" w:before="0" w:line="360" w:lineRule="auto"/>
-        <w:rPr>
-          <w:sz w:val="24"/>
-          <w:szCs w:val="24"/>
-        </w:rPr>
-      </w:pPr>
-      <w:r>
-        <w:rPr>
-          <w:b w:val="1"/>
-          <w:bCs w:val="1"/>
-          <w:sz w:val="24"/>
-          <w:szCs w:val="24"/>
-          <w:u w:val="single"/>
-          <w:rtl w:val="0"/>
-        </w:rPr>
-        <w:t xml:space="preserve">Opción 5</w:t>
-      </w:r>
-      <w:r>
-        <w:rPr>
-          <w:sz w:val="24"/>
-          <w:szCs w:val="24"/>
-          <w:rtl w:val="0"/>
-        </w:rPr>
-        <w:t xml:space="preserve">: Modificar libro.</w:t>
-      </w:r>
-    </w:p>
-    <w:p>
-      <w:pPr>
-        <w:spacing w:after="0" w:before="0" w:line="360" w:lineRule="auto"/>
-        <w:rPr>
-          <w:sz w:val="24"/>
-          <w:szCs w:val="24"/>
-        </w:rPr>
-      </w:pPr>
-      <w:r>
-        <w:rPr>
-          <w:sz w:val="24"/>
-          <w:szCs w:val="24"/>
-          <w:rtl w:val="0"/>
-        </w:rPr>
-        <w:t xml:space="preserve">En esta opción se actualizan los datos de un libro existente identificado por su título utilizando </w:t>
-      </w:r>
-      <w:r>
-        <w:rPr>
-          <w:sz w:val="24"/>
-          <w:szCs w:val="24"/>
-          <w:rtl w:val="0"/>
-        </w:rPr>
-        <w:t xml:space="preserve">requests.put(f"{URL}/libros/{titulo}", json=libro, auth=(USUARIO, PASSWORD))</w:t>
-      </w:r>
-      <w:r>
-        <w:rPr>
-          <w:sz w:val="24"/>
-          <w:szCs w:val="24"/>
-          <w:rtl w:val="0"/>
-        </w:rPr>
-        <w:t xml:space="preserve">. Esta operación requiere autenticación. </w:t>
-      </w:r>
-    </w:p>
-    <w:p>
-      <w:pPr>
-        <w:spacing w:after="0" w:before="0" w:line="360" w:lineRule="auto"/>
-        <w:rPr>
-          <w:sz w:val="24"/>
-          <w:szCs w:val="24"/>
-        </w:rPr>
-      </w:pPr>
-      <w:r>
-        <w:rPr>
-          <w:rtl w:val="0"/>
-        </w:rPr>
-      </w:r>
-    </w:p>
-    <w:p>
-      <w:pPr>
-        <w:spacing w:after="0" w:before="0" w:line="360" w:lineRule="auto"/>
-        <w:rPr>
-          <w:sz w:val="24"/>
-          <w:szCs w:val="24"/>
-        </w:rPr>
-      </w:pPr>
-      <w:r>
-        <w:rPr>
-          <w:b w:val="1"/>
-          <w:bCs w:val="1"/>
-          <w:sz w:val="24"/>
-          <w:szCs w:val="24"/>
-          <w:u w:val="single"/>
-          <w:rtl w:val="0"/>
-        </w:rPr>
-        <w:t xml:space="preserve">Opción 6</w:t>
-      </w:r>
-      <w:r>
-        <w:rPr>
-          <w:sz w:val="24"/>
-          <w:szCs w:val="24"/>
-          <w:rtl w:val="0"/>
-        </w:rPr>
-        <w:t xml:space="preserve">: Eliminar libro.</w:t>
-        <w:br w:type="textWrapping"/>
-        <w:t xml:space="preserve"> En esta opción se elimina un libro de la base de datos según su título utilizando </w:t>
-      </w:r>
-      <w:r>
-        <w:rPr>
-          <w:sz w:val="24"/>
-          <w:szCs w:val="24"/>
-          <w:rtl w:val="0"/>
-        </w:rPr>
-        <w:t xml:space="preserve">requests.delete(f"{URL}/libros/{titulo}", auth=(USUARIO, PASSWORD))</w:t>
-      </w:r>
-      <w:r>
-        <w:rPr>
-          <w:sz w:val="24"/>
-          <w:szCs w:val="24"/>
-          <w:rtl w:val="0"/>
-        </w:rPr>
-        <w:t xml:space="preserve">. Esta operación requiere autenticación.</w:t>
-      </w:r>
-    </w:p>
-    <w:p>
-      <w:pPr>
-        <w:spacing w:after="0" w:before="0" w:line="360" w:lineRule="auto"/>
-        <w:rPr>
-          <w:sz w:val="24"/>
-          <w:szCs w:val="24"/>
-        </w:rPr>
-      </w:pPr>
-      <w:r>
-        <w:rPr>
-          <w:rtl w:val="0"/>
-        </w:rPr>
-      </w:r>
-    </w:p>
-    <w:p>
-      <w:pPr>
-        <w:spacing w:after="0" w:before="0" w:line="360" w:lineRule="auto"/>
-        <w:rPr>
-          <w:sz w:val="24"/>
-          <w:szCs w:val="24"/>
-        </w:rPr>
-      </w:pPr>
-      <w:r>
-        <w:rPr>
-          <w:b w:val="1"/>
-          <w:bCs w:val="1"/>
-          <w:sz w:val="24"/>
-          <w:szCs w:val="24"/>
-          <w:u w:val="single"/>
-          <w:rtl w:val="0"/>
-        </w:rPr>
-        <w:t xml:space="preserve">Opción 7</w:t>
-      </w:r>
-      <w:r>
-        <w:rPr>
-          <w:sz w:val="24"/>
-          <w:szCs w:val="24"/>
-          <w:rtl w:val="0"/>
-        </w:rPr>
-        <w:t xml:space="preserve">: Abrir documentación de la API.</w:t>
-        <w:br w:type="textWrapping"/>
-        <w:t xml:space="preserve">En esta opción se abre en el navegador la documentación automática de la API generada por FastAPI utilizando </w:t>
-      </w:r>
-      <w:r>
-        <w:rPr>
-          <w:sz w:val="24"/>
-          <w:szCs w:val="24"/>
-          <w:rtl w:val="0"/>
-        </w:rPr>
-        <w:t xml:space="preserve">webbrowser.open(f"{URL}/docs")</w:t>
-      </w:r>
-      <w:r>
-        <w:rPr>
-          <w:sz w:val="24"/>
-          <w:szCs w:val="24"/>
-          <w:rtl w:val="0"/>
-        </w:rPr>
-        <w:t xml:space="preserve">.</w:t>
+        <w:t>Opción 4: Buscar por país.</w:t>
+        <w:br/>
+        <w:t>En esta opción se buscan libros filtrados por el país utilizando requests.get(f"{URL}/pais/{pais}").</w:t>
+        <w:br/>
+        <w:br/>
+        <w:t>Opción 5: Agregar libro.</w:t>
+      </w:r>
+    </w:p>
+    <w:p>
+      <w:pPr>
+        <w:spacing w:after="0" w:before="0" w:line="360" w:lineRule="auto"/>
+        <w:rPr>
+          <w:sz w:val="24"/>
+          <w:szCs w:val="24"/>
+        </w:rPr>
+      </w:pPr>
+      <w:r>
+        <w:t xml:space="preserve">En esta opción se permite agregar un nuevo libro a la base de datos enviando los datos en formato JSON mediante hacer_peticion('POST', "/libros", json=libro, auth=(USUARIO, PASSWORD)). Esta operación requiere autenticación. </w:t>
+      </w:r>
+    </w:p>
+    <w:p>
+      <w:pPr>
+        <w:spacing w:after="0" w:before="0" w:line="360" w:lineRule="auto"/>
+        <w:rPr>
+          <w:sz w:val="24"/>
+          <w:szCs w:val="24"/>
+        </w:rPr>
+      </w:pPr>
+      <w:r>
+        <w:rPr>
+          <w:rtl w:val="0"/>
+        </w:rPr>
+      </w:r>
+    </w:p>
+    <w:p>
+      <w:pPr>
+        <w:spacing w:after="0" w:before="0" w:line="360" w:lineRule="auto"/>
+        <w:rPr>
+          <w:sz w:val="24"/>
+          <w:szCs w:val="24"/>
+        </w:rPr>
+      </w:pPr>
+      <w:r>
+        <w:t>Opción 6: Modificar libro.</w:t>
+      </w:r>
+    </w:p>
+    <w:p>
+      <w:pPr>
+        <w:spacing w:after="0" w:before="0" w:line="360" w:lineRule="auto"/>
+        <w:rPr>
+          <w:sz w:val="24"/>
+          <w:szCs w:val="24"/>
+        </w:rPr>
+      </w:pPr>
+      <w:r>
+        <w:t xml:space="preserve">En esta opción se actualizan los datos de un libro existente identificado por su título utilizando hacer_peticion('PUT', f"/libros/{titulo}", json=libro, auth=(USUARIO, PASSWORD)). Esta operación requiere autenticación. </w:t>
+      </w:r>
+    </w:p>
+    <w:p>
+      <w:pPr>
+        <w:spacing w:after="0" w:before="0" w:line="360" w:lineRule="auto"/>
+        <w:rPr>
+          <w:sz w:val="24"/>
+          <w:szCs w:val="24"/>
+        </w:rPr>
+      </w:pPr>
+      <w:r>
+        <w:rPr>
+          <w:rtl w:val="0"/>
+        </w:rPr>
+      </w:r>
+    </w:p>
+    <w:p>
+      <w:pPr>
+        <w:spacing w:after="0" w:before="0" w:line="360" w:lineRule="auto"/>
+        <w:rPr>
+          <w:sz w:val="24"/>
+          <w:szCs w:val="24"/>
+        </w:rPr>
+      </w:pPr>
+      <w:r>
+        <w:t>Opción 7: Eliminar libro.</w:t>
+        <w:br/>
+        <w:t xml:space="preserve"> En esta opción se elimina un libro de la base de datos según su título utilizando requests.delete(f"{URL}/libros/{titulo}", auth=(USUARIO, PASSWORD)). Esta operación requiere autenticación.</w:t>
+      </w:r>
+    </w:p>
+    <w:p>
+      <w:pPr>
+        <w:spacing w:after="0" w:before="0" w:line="360" w:lineRule="auto"/>
+        <w:rPr>
+          <w:sz w:val="24"/>
+          <w:szCs w:val="24"/>
+        </w:rPr>
+      </w:pPr>
+      <w:r>
+        <w:rPr>
+          <w:rtl w:val="0"/>
+        </w:rPr>
+      </w:r>
+    </w:p>
+    <w:p>
+      <w:pPr>
+        <w:spacing w:after="0" w:before="0" w:line="360" w:lineRule="auto"/>
+        <w:rPr>
+          <w:sz w:val="24"/>
+          <w:szCs w:val="24"/>
+        </w:rPr>
+      </w:pPr>
+      <w:r>
+        <w:t>Opción 8: Abrir documentación de la API.</w:t>
+        <w:br/>
+        <w:t>En esta opción se abre en el navegador la documentación automática de la API generada por FastAPI utilizando webbrowser.open(f"{URL}/docs").</w:t>
       </w:r>
     </w:p>
     <w:p>
@@ -2559,28 +2402,7 @@
         </w:rPr>
       </w:pPr>
       <w:r>
-        <w:rPr>
-          <w:sz w:val="24"/>
-          <w:szCs w:val="24"/>
-          <w:rtl w:val="0"/>
-        </w:rPr>
-        <w:t xml:space="preserve">C:/TpRedesDatos&gt;python -m </w:t>
-      </w:r>
-      <w:r>
-        <w:rPr>
-          <w:sz w:val="24"/>
-          <w:szCs w:val="24"/>
-          <w:rtl w:val="0"/>
-        </w:rPr>
-        <w:t xml:space="preserve">uvicorn</w:t>
-      </w:r>
-      <w:r>
-        <w:rPr>
-          <w:sz w:val="24"/>
-          <w:szCs w:val="24"/>
-          <w:rtl w:val="0"/>
-        </w:rPr>
-        <w:t xml:space="preserve"> libros:app --reload </w:t>
+        <w:t xml:space="preserve">C:/TpRedesDatos&gt;python libros.py </w:t>
       </w:r>
     </w:p>
     <w:p>

</xml_diff>